<commit_message>
Update Sahil individual work documentation with Milestone 1 Full-Stack (Frontend, Backend, Database)
</commit_message>
<xml_diff>
--- a/Individual work - Sahil.docx
+++ b/Individual work - Sahil.docx
@@ -151,7 +151,7 @@
     </w:p>
     <w:p>
       <w:pPr>
-        <w:spacing w:after="240"/>
+        <w:spacing w:after="200"/>
         <w:jc w:val="center"/>
       </w:pPr>
       <w:r>
@@ -173,21 +173,21 @@
           <w:rFonts w:ascii="Calibri" w:hAnsi="Calibri"/>
           <w:b/>
           <w:color w:val="1F4E79"/>
-          <w:sz w:val="25"/>
+          <w:sz w:val="24"/>
         </w:rPr>
-        <w:t>Milestone 1 – Data Ingestion Pipeline, Robust Preprocessing &amp; System Foundation</w:t>
+        <w:t>Milestone 1 – Full-Stack Development: Frontend, Backend &amp; Database Architecture</w:t>
       </w:r>
     </w:p>
     <w:p>
       <w:pPr>
-        <w:spacing w:after="160"/>
+        <w:spacing w:after="120"/>
       </w:pPr>
       <w:r>
         <w:rPr>
           <w:rFonts w:ascii="Calibri" w:hAnsi="Calibri"/>
           <w:sz w:val="19"/>
         </w:rPr>
-        <w:t>This milestone focused on architecting the full-stack system foundation, establishing the database ORM schemas, and building a robust data ingestion and sanitization pipeline for the Superstore retail transaction dataset (data.csv). Complex data-quality issues—specifically pluralized string units in numerical fields, mixed date formatting, and customer profile aggregations—were identified, cleaned and validated to ensure reliable inputs for downstream predictive models.</w:t>
+        <w:t>This milestone focused on designing, developing, and architecting the core full-stack foundation of the MarketMind AI platform. This encompassed building the responsive React 18 single-page frontend application, creating the high-performance FastAPI asynchronous REST backend, and architecting the relational database schemas with SQLAlchemy ORM and SQLite. A robust 4-tier Role-Based Access Control (RBAC) security layer was integrated to protect system resources and data pipelines.</w:t>
       </w:r>
     </w:p>
     <w:tbl>
@@ -207,10 +207,10 @@
             <w:tcW w:type="dxa" w:w="3024"/>
             <w:shd w:fill="1F4E79"/>
             <w:tcMar>
-              <w:top w:w="80" w:type="dxa"/>
-              <w:bottom w:w="80" w:type="dxa"/>
-              <w:left w:w="100" w:type="dxa"/>
-              <w:right w:w="100" w:type="dxa"/>
+              <w:top w:w="70" w:type="dxa"/>
+              <w:bottom w:w="70" w:type="dxa"/>
+              <w:left w:w="90" w:type="dxa"/>
+              <w:right w:w="90" w:type="dxa"/>
             </w:tcMar>
             <w:tcBorders>
               <w:top w:val="single" w:sz="4" w:space="0" w:color="8EA9C1"/>
@@ -239,10 +239,10 @@
             <w:tcW w:type="dxa" w:w="7056"/>
             <w:shd w:fill="1F4E79"/>
             <w:tcMar>
-              <w:top w:w="80" w:type="dxa"/>
-              <w:bottom w:w="80" w:type="dxa"/>
-              <w:left w:w="100" w:type="dxa"/>
-              <w:right w:w="100" w:type="dxa"/>
+              <w:top w:w="70" w:type="dxa"/>
+              <w:bottom w:w="70" w:type="dxa"/>
+              <w:left w:w="90" w:type="dxa"/>
+              <w:right w:w="90" w:type="dxa"/>
             </w:tcMar>
             <w:tcBorders>
               <w:top w:val="single" w:sz="4" w:space="0" w:color="8EA9C1"/>
@@ -273,10 +273,10 @@
             <w:tcW w:type="dxa" w:w="3024"/>
             <w:shd w:fill="FFFFFF"/>
             <w:tcMar>
-              <w:top w:w="60" w:type="dxa"/>
-              <w:bottom w:w="60" w:type="dxa"/>
-              <w:left w:w="90" w:type="dxa"/>
-              <w:right w:w="90" w:type="dxa"/>
+              <w:top w:w="55" w:type="dxa"/>
+              <w:bottom w:w="55" w:type="dxa"/>
+              <w:left w:w="80" w:type="dxa"/>
+              <w:right w:w="80" w:type="dxa"/>
             </w:tcMar>
             <w:tcBorders>
               <w:top w:val="single" w:sz="4" w:space="0" w:color="8EA9C1"/>
@@ -296,7 +296,7 @@
                 <w:color w:val="1A1A1A"/>
                 <w:sz w:val="18"/>
               </w:rPr>
-              <w:t>System Architecture &amp; Scaffolding</w:t>
+              <w:t>Frontend Development (React 18)</w:t>
             </w:r>
           </w:p>
         </w:tc>
@@ -305,10 +305,10 @@
             <w:tcW w:type="dxa" w:w="7056"/>
             <w:shd w:fill="FFFFFF"/>
             <w:tcMar>
-              <w:top w:w="60" w:type="dxa"/>
-              <w:bottom w:w="60" w:type="dxa"/>
-              <w:left w:w="90" w:type="dxa"/>
-              <w:right w:w="90" w:type="dxa"/>
+              <w:top w:w="55" w:type="dxa"/>
+              <w:bottom w:w="55" w:type="dxa"/>
+              <w:left w:w="80" w:type="dxa"/>
+              <w:right w:w="80" w:type="dxa"/>
             </w:tcMar>
             <w:tcBorders>
               <w:top w:val="single" w:sz="4" w:space="0" w:color="8EA9C1"/>
@@ -327,7 +327,7 @@
                 <w:color w:val="1A1A1A"/>
                 <w:sz w:val="18"/>
               </w:rPr>
-              <w:t>Established asynchronous FastAPI REST backend, modular architecture, and React 18 frontend client.</w:t>
+              <w:t>Built responsive single-page web client using React 18 &amp; Vite, reusable layout components (Sidebar, Header, ProtectedRoute), and custom CSS design system.</w:t>
             </w:r>
           </w:p>
         </w:tc>
@@ -338,10 +338,10 @@
             <w:tcW w:type="dxa" w:w="3024"/>
             <w:shd w:fill="DCE6F1"/>
             <w:tcMar>
-              <w:top w:w="60" w:type="dxa"/>
-              <w:bottom w:w="60" w:type="dxa"/>
-              <w:left w:w="90" w:type="dxa"/>
-              <w:right w:w="90" w:type="dxa"/>
+              <w:top w:w="55" w:type="dxa"/>
+              <w:bottom w:w="55" w:type="dxa"/>
+              <w:left w:w="80" w:type="dxa"/>
+              <w:right w:w="80" w:type="dxa"/>
             </w:tcMar>
             <w:tcBorders>
               <w:top w:val="single" w:sz="4" w:space="0" w:color="8EA9C1"/>
@@ -361,7 +361,7 @@
                 <w:color w:val="1A1A1A"/>
                 <w:sz w:val="18"/>
               </w:rPr>
-              <w:t>Data Ingestion Pipeline</w:t>
+              <w:t>Backend Architecture (FastAPI)</w:t>
             </w:r>
           </w:p>
         </w:tc>
@@ -370,10 +370,10 @@
             <w:tcW w:type="dxa" w:w="7056"/>
             <w:shd w:fill="DCE6F1"/>
             <w:tcMar>
-              <w:top w:w="60" w:type="dxa"/>
-              <w:bottom w:w="60" w:type="dxa"/>
-              <w:left w:w="90" w:type="dxa"/>
-              <w:right w:w="90" w:type="dxa"/>
+              <w:top w:w="55" w:type="dxa"/>
+              <w:bottom w:w="55" w:type="dxa"/>
+              <w:left w:w="80" w:type="dxa"/>
+              <w:right w:w="80" w:type="dxa"/>
             </w:tcMar>
             <w:tcBorders>
               <w:top w:val="single" w:sz="4" w:space="0" w:color="8EA9C1"/>
@@ -392,7 +392,7 @@
                 <w:color w:val="1A1A1A"/>
                 <w:sz w:val="18"/>
               </w:rPr>
-              <w:t>Ingested real-world commercial transaction records (data.csv) spanning 9,800 orders across 793 customers.</w:t>
+              <w:t>Created asynchronous RESTful backend API with Uvicorn, modular routing layout (/sales, /products, /customers, /auth), and CORS middleware.</w:t>
             </w:r>
           </w:p>
         </w:tc>
@@ -403,10 +403,10 @@
             <w:tcW w:type="dxa" w:w="3024"/>
             <w:shd w:fill="FFFFFF"/>
             <w:tcMar>
-              <w:top w:w="60" w:type="dxa"/>
-              <w:bottom w:w="60" w:type="dxa"/>
-              <w:left w:w="90" w:type="dxa"/>
-              <w:right w:w="90" w:type="dxa"/>
+              <w:top w:w="55" w:type="dxa"/>
+              <w:bottom w:w="55" w:type="dxa"/>
+              <w:left w:w="80" w:type="dxa"/>
+              <w:right w:w="80" w:type="dxa"/>
             </w:tcMar>
             <w:tcBorders>
               <w:top w:val="single" w:sz="4" w:space="0" w:color="8EA9C1"/>
@@ -426,7 +426,7 @@
                 <w:color w:val="1A1A1A"/>
                 <w:sz w:val="18"/>
               </w:rPr>
-              <w:t>String Pluralization Sanitization</w:t>
+              <w:t>Relational Database Design</w:t>
             </w:r>
           </w:p>
         </w:tc>
@@ -435,10 +435,10 @@
             <w:tcW w:type="dxa" w:w="7056"/>
             <w:shd w:fill="FFFFFF"/>
             <w:tcMar>
-              <w:top w:w="60" w:type="dxa"/>
-              <w:bottom w:w="60" w:type="dxa"/>
-              <w:left w:w="90" w:type="dxa"/>
-              <w:right w:w="90" w:type="dxa"/>
+              <w:top w:w="55" w:type="dxa"/>
+              <w:bottom w:w="55" w:type="dxa"/>
+              <w:left w:w="80" w:type="dxa"/>
+              <w:right w:w="80" w:type="dxa"/>
             </w:tcMar>
             <w:tcBorders>
               <w:top w:val="single" w:sz="4" w:space="0" w:color="8EA9C1"/>
@@ -457,7 +457,7 @@
                 <w:color w:val="1A1A1A"/>
                 <w:sz w:val="18"/>
               </w:rPr>
-              <w:t>Developed regex parsers (clean_pluralized_string, _clean_numeric) to safely strip plural unit suffixes ('items', 'days', 'units') and eliminate type errors.</w:t>
+              <w:t>Architected relational schemas using SQLAlchemy ORM and SQLite for User, Role, Permission, Customer, Product, Invoice, and InvoiceItem models.</w:t>
             </w:r>
           </w:p>
         </w:tc>
@@ -468,10 +468,10 @@
             <w:tcW w:type="dxa" w:w="3024"/>
             <w:shd w:fill="DCE6F1"/>
             <w:tcMar>
-              <w:top w:w="60" w:type="dxa"/>
-              <w:bottom w:w="60" w:type="dxa"/>
-              <w:left w:w="90" w:type="dxa"/>
-              <w:right w:w="90" w:type="dxa"/>
+              <w:top w:w="55" w:type="dxa"/>
+              <w:bottom w:w="55" w:type="dxa"/>
+              <w:left w:w="80" w:type="dxa"/>
+              <w:right w:w="80" w:type="dxa"/>
             </w:tcMar>
             <w:tcBorders>
               <w:top w:val="single" w:sz="4" w:space="0" w:color="8EA9C1"/>
@@ -491,7 +491,7 @@
                 <w:color w:val="1A1A1A"/>
                 <w:sz w:val="18"/>
               </w:rPr>
-              <w:t>Time-Series Chronological Aggregation</w:t>
+              <w:t>Database Initialization &amp; Seeding</w:t>
             </w:r>
           </w:p>
         </w:tc>
@@ -500,10 +500,10 @@
             <w:tcW w:type="dxa" w:w="7056"/>
             <w:shd w:fill="DCE6F1"/>
             <w:tcMar>
-              <w:top w:w="60" w:type="dxa"/>
-              <w:bottom w:w="60" w:type="dxa"/>
-              <w:left w:w="90" w:type="dxa"/>
-              <w:right w:w="90" w:type="dxa"/>
+              <w:top w:w="55" w:type="dxa"/>
+              <w:bottom w:w="55" w:type="dxa"/>
+              <w:left w:w="80" w:type="dxa"/>
+              <w:right w:w="80" w:type="dxa"/>
             </w:tcMar>
             <w:tcBorders>
               <w:top w:val="single" w:sz="4" w:space="0" w:color="8EA9C1"/>
@@ -522,7 +522,7 @@
                 <w:color w:val="1A1A1A"/>
                 <w:sz w:val="18"/>
               </w:rPr>
-              <w:t>Engineered day-first date validation and aggregated daily transaction logs into weekly and monthly continuous revenue streams.</w:t>
+              <w:t>Developed automated database setup scripts (db_setup.py, seed.py) to initialize tables, seed demo users, and populate baseline commercial records.</w:t>
             </w:r>
           </w:p>
         </w:tc>
@@ -533,10 +533,10 @@
             <w:tcW w:type="dxa" w:w="3024"/>
             <w:shd w:fill="FFFFFF"/>
             <w:tcMar>
-              <w:top w:w="60" w:type="dxa"/>
-              <w:bottom w:w="60" w:type="dxa"/>
-              <w:left w:w="90" w:type="dxa"/>
-              <w:right w:w="90" w:type="dxa"/>
+              <w:top w:w="55" w:type="dxa"/>
+              <w:bottom w:w="55" w:type="dxa"/>
+              <w:left w:w="80" w:type="dxa"/>
+              <w:right w:w="80" w:type="dxa"/>
             </w:tcMar>
             <w:tcBorders>
               <w:top w:val="single" w:sz="4" w:space="0" w:color="8EA9C1"/>
@@ -556,7 +556,7 @@
                 <w:color w:val="1A1A1A"/>
                 <w:sz w:val="18"/>
               </w:rPr>
-              <w:t>Customer Profile Aggregation</w:t>
+              <w:t>Authentication &amp; RBAC Security</w:t>
             </w:r>
           </w:p>
         </w:tc>
@@ -565,10 +565,10 @@
             <w:tcW w:type="dxa" w:w="7056"/>
             <w:shd w:fill="FFFFFF"/>
             <w:tcMar>
-              <w:top w:w="60" w:type="dxa"/>
-              <w:bottom w:w="60" w:type="dxa"/>
-              <w:left w:w="90" w:type="dxa"/>
-              <w:right w:w="90" w:type="dxa"/>
+              <w:top w:w="55" w:type="dxa"/>
+              <w:bottom w:w="55" w:type="dxa"/>
+              <w:left w:w="80" w:type="dxa"/>
+              <w:right w:w="80" w:type="dxa"/>
             </w:tcMar>
             <w:tcBorders>
               <w:top w:val="single" w:sz="4" w:space="0" w:color="8EA9C1"/>
@@ -587,7 +587,7 @@
                 <w:color w:val="1A1A1A"/>
                 <w:sz w:val="18"/>
               </w:rPr>
-              <w:t>Processed customer purchase history, lifetime monetary value, first/last purchase dates, and segment associations.</w:t>
+              <w:t>Implemented secure JWT-based token authentication and 4-tier Role-Based Access Control (ADMIN, OWNER, MANAGER, SALES) across endpoints.</w:t>
             </w:r>
           </w:p>
         </w:tc>
@@ -598,10 +598,10 @@
             <w:tcW w:type="dxa" w:w="3024"/>
             <w:shd w:fill="DCE6F1"/>
             <w:tcMar>
-              <w:top w:w="60" w:type="dxa"/>
-              <w:bottom w:w="60" w:type="dxa"/>
-              <w:left w:w="90" w:type="dxa"/>
-              <w:right w:w="90" w:type="dxa"/>
+              <w:top w:w="55" w:type="dxa"/>
+              <w:bottom w:w="55" w:type="dxa"/>
+              <w:left w:w="80" w:type="dxa"/>
+              <w:right w:w="80" w:type="dxa"/>
             </w:tcMar>
             <w:tcBorders>
               <w:top w:val="single" w:sz="4" w:space="0" w:color="8EA9C1"/>
@@ -621,7 +621,7 @@
                 <w:color w:val="1A1A1A"/>
                 <w:sz w:val="18"/>
               </w:rPr>
-              <w:t>Role-Based Security (RBAC)</w:t>
+              <w:t>API Service Layer Integration</w:t>
             </w:r>
           </w:p>
         </w:tc>
@@ -630,10 +630,10 @@
             <w:tcW w:type="dxa" w:w="7056"/>
             <w:shd w:fill="DCE6F1"/>
             <w:tcMar>
-              <w:top w:w="60" w:type="dxa"/>
-              <w:bottom w:w="60" w:type="dxa"/>
-              <w:left w:w="90" w:type="dxa"/>
-              <w:right w:w="90" w:type="dxa"/>
+              <w:top w:w="55" w:type="dxa"/>
+              <w:bottom w:w="55" w:type="dxa"/>
+              <w:left w:w="80" w:type="dxa"/>
+              <w:right w:w="80" w:type="dxa"/>
             </w:tcMar>
             <w:tcBorders>
               <w:top w:val="single" w:sz="4" w:space="0" w:color="8EA9C1"/>
@@ -652,7 +652,7 @@
                 <w:color w:val="1A1A1A"/>
                 <w:sz w:val="18"/>
               </w:rPr>
-              <w:t>Implemented JWT authentication and 4-tier role-based access control (ADMIN, OWNER, MANAGER, SALES) securing sensitive endpoints.</w:t>
+              <w:t>Engineered centralized frontend API client (api.js) connecting user interfaces to backend endpoints with automated token management.</w:t>
             </w:r>
           </w:p>
         </w:tc>
@@ -660,7 +660,7 @@
     </w:tbl>
     <w:p>
       <w:pPr>
-        <w:spacing w:before="200"/>
+        <w:spacing w:before="160"/>
       </w:pPr>
     </w:p>
     <w:p>
@@ -672,14 +672,14 @@
           <w:rFonts w:ascii="Calibri" w:hAnsi="Calibri"/>
           <w:b/>
           <w:color w:val="1F4E79"/>
-          <w:sz w:val="25"/>
+          <w:sz w:val="24"/>
         </w:rPr>
         <w:t>Milestone 2 – AI Revenue &amp; Demand Forecasting Engine</w:t>
       </w:r>
     </w:p>
     <w:p>
       <w:pPr>
-        <w:spacing w:after="160"/>
+        <w:spacing w:after="120"/>
       </w:pPr>
       <w:r>
         <w:rPr>
@@ -706,10 +706,10 @@
             <w:tcW w:type="dxa" w:w="3024"/>
             <w:shd w:fill="1F4E79"/>
             <w:tcMar>
-              <w:top w:w="80" w:type="dxa"/>
-              <w:bottom w:w="80" w:type="dxa"/>
-              <w:left w:w="100" w:type="dxa"/>
-              <w:right w:w="100" w:type="dxa"/>
+              <w:top w:w="70" w:type="dxa"/>
+              <w:bottom w:w="70" w:type="dxa"/>
+              <w:left w:w="90" w:type="dxa"/>
+              <w:right w:w="90" w:type="dxa"/>
             </w:tcMar>
             <w:tcBorders>
               <w:top w:val="single" w:sz="4" w:space="0" w:color="8EA9C1"/>
@@ -738,10 +738,10 @@
             <w:tcW w:type="dxa" w:w="7056"/>
             <w:shd w:fill="1F4E79"/>
             <w:tcMar>
-              <w:top w:w="80" w:type="dxa"/>
-              <w:bottom w:w="80" w:type="dxa"/>
-              <w:left w:w="100" w:type="dxa"/>
-              <w:right w:w="100" w:type="dxa"/>
+              <w:top w:w="70" w:type="dxa"/>
+              <w:bottom w:w="70" w:type="dxa"/>
+              <w:left w:w="90" w:type="dxa"/>
+              <w:right w:w="90" w:type="dxa"/>
             </w:tcMar>
             <w:tcBorders>
               <w:top w:val="single" w:sz="4" w:space="0" w:color="8EA9C1"/>
@@ -772,10 +772,10 @@
             <w:tcW w:type="dxa" w:w="3024"/>
             <w:shd w:fill="FFFFFF"/>
             <w:tcMar>
-              <w:top w:w="60" w:type="dxa"/>
-              <w:bottom w:w="60" w:type="dxa"/>
-              <w:left w:w="90" w:type="dxa"/>
-              <w:right w:w="90" w:type="dxa"/>
+              <w:top w:w="55" w:type="dxa"/>
+              <w:bottom w:w="55" w:type="dxa"/>
+              <w:left w:w="80" w:type="dxa"/>
+              <w:right w:w="80" w:type="dxa"/>
             </w:tcMar>
             <w:tcBorders>
               <w:top w:val="single" w:sz="4" w:space="0" w:color="8EA9C1"/>
@@ -804,10 +804,10 @@
             <w:tcW w:type="dxa" w:w="7056"/>
             <w:shd w:fill="FFFFFF"/>
             <w:tcMar>
-              <w:top w:w="60" w:type="dxa"/>
-              <w:bottom w:w="60" w:type="dxa"/>
-              <w:left w:w="90" w:type="dxa"/>
-              <w:right w:w="90" w:type="dxa"/>
+              <w:top w:w="55" w:type="dxa"/>
+              <w:bottom w:w="55" w:type="dxa"/>
+              <w:left w:w="80" w:type="dxa"/>
+              <w:right w:w="80" w:type="dxa"/>
             </w:tcMar>
             <w:tcBorders>
               <w:top w:val="single" w:sz="4" w:space="0" w:color="8EA9C1"/>
@@ -837,10 +837,10 @@
             <w:tcW w:type="dxa" w:w="3024"/>
             <w:shd w:fill="DCE6F1"/>
             <w:tcMar>
-              <w:top w:w="60" w:type="dxa"/>
-              <w:bottom w:w="60" w:type="dxa"/>
-              <w:left w:w="90" w:type="dxa"/>
-              <w:right w:w="90" w:type="dxa"/>
+              <w:top w:w="55" w:type="dxa"/>
+              <w:bottom w:w="55" w:type="dxa"/>
+              <w:left w:w="80" w:type="dxa"/>
+              <w:right w:w="80" w:type="dxa"/>
             </w:tcMar>
             <w:tcBorders>
               <w:top w:val="single" w:sz="4" w:space="0" w:color="8EA9C1"/>
@@ -869,10 +869,10 @@
             <w:tcW w:type="dxa" w:w="7056"/>
             <w:shd w:fill="DCE6F1"/>
             <w:tcMar>
-              <w:top w:w="60" w:type="dxa"/>
-              <w:bottom w:w="60" w:type="dxa"/>
-              <w:left w:w="90" w:type="dxa"/>
-              <w:right w:w="90" w:type="dxa"/>
+              <w:top w:w="55" w:type="dxa"/>
+              <w:bottom w:w="55" w:type="dxa"/>
+              <w:left w:w="80" w:type="dxa"/>
+              <w:right w:w="80" w:type="dxa"/>
             </w:tcMar>
             <w:tcBorders>
               <w:top w:val="single" w:sz="4" w:space="0" w:color="8EA9C1"/>
@@ -902,10 +902,10 @@
             <w:tcW w:type="dxa" w:w="3024"/>
             <w:shd w:fill="FFFFFF"/>
             <w:tcMar>
-              <w:top w:w="60" w:type="dxa"/>
-              <w:bottom w:w="60" w:type="dxa"/>
-              <w:left w:w="90" w:type="dxa"/>
-              <w:right w:w="90" w:type="dxa"/>
+              <w:top w:w="55" w:type="dxa"/>
+              <w:bottom w:w="55" w:type="dxa"/>
+              <w:left w:w="80" w:type="dxa"/>
+              <w:right w:w="80" w:type="dxa"/>
             </w:tcMar>
             <w:tcBorders>
               <w:top w:val="single" w:sz="4" w:space="0" w:color="8EA9C1"/>
@@ -934,10 +934,10 @@
             <w:tcW w:type="dxa" w:w="7056"/>
             <w:shd w:fill="FFFFFF"/>
             <w:tcMar>
-              <w:top w:w="60" w:type="dxa"/>
-              <w:bottom w:w="60" w:type="dxa"/>
-              <w:left w:w="90" w:type="dxa"/>
-              <w:right w:w="90" w:type="dxa"/>
+              <w:top w:w="55" w:type="dxa"/>
+              <w:bottom w:w="55" w:type="dxa"/>
+              <w:left w:w="80" w:type="dxa"/>
+              <w:right w:w="80" w:type="dxa"/>
             </w:tcMar>
             <w:tcBorders>
               <w:top w:val="single" w:sz="4" w:space="0" w:color="8EA9C1"/>
@@ -967,10 +967,10 @@
             <w:tcW w:type="dxa" w:w="3024"/>
             <w:shd w:fill="DCE6F1"/>
             <w:tcMar>
-              <w:top w:w="60" w:type="dxa"/>
-              <w:bottom w:w="60" w:type="dxa"/>
-              <w:left w:w="90" w:type="dxa"/>
-              <w:right w:w="90" w:type="dxa"/>
+              <w:top w:w="55" w:type="dxa"/>
+              <w:bottom w:w="55" w:type="dxa"/>
+              <w:left w:w="80" w:type="dxa"/>
+              <w:right w:w="80" w:type="dxa"/>
             </w:tcMar>
             <w:tcBorders>
               <w:top w:val="single" w:sz="4" w:space="0" w:color="8EA9C1"/>
@@ -999,10 +999,10 @@
             <w:tcW w:type="dxa" w:w="7056"/>
             <w:shd w:fill="DCE6F1"/>
             <w:tcMar>
-              <w:top w:w="60" w:type="dxa"/>
-              <w:bottom w:w="60" w:type="dxa"/>
-              <w:left w:w="90" w:type="dxa"/>
-              <w:right w:w="90" w:type="dxa"/>
+              <w:top w:w="55" w:type="dxa"/>
+              <w:bottom w:w="55" w:type="dxa"/>
+              <w:left w:w="80" w:type="dxa"/>
+              <w:right w:w="80" w:type="dxa"/>
             </w:tcMar>
             <w:tcBorders>
               <w:top w:val="single" w:sz="4" w:space="0" w:color="8EA9C1"/>
@@ -1032,10 +1032,10 @@
             <w:tcW w:type="dxa" w:w="3024"/>
             <w:shd w:fill="FFFFFF"/>
             <w:tcMar>
-              <w:top w:w="60" w:type="dxa"/>
-              <w:bottom w:w="60" w:type="dxa"/>
-              <w:left w:w="90" w:type="dxa"/>
-              <w:right w:w="90" w:type="dxa"/>
+              <w:top w:w="55" w:type="dxa"/>
+              <w:bottom w:w="55" w:type="dxa"/>
+              <w:left w:w="80" w:type="dxa"/>
+              <w:right w:w="80" w:type="dxa"/>
             </w:tcMar>
             <w:tcBorders>
               <w:top w:val="single" w:sz="4" w:space="0" w:color="8EA9C1"/>
@@ -1064,10 +1064,10 @@
             <w:tcW w:type="dxa" w:w="7056"/>
             <w:shd w:fill="FFFFFF"/>
             <w:tcMar>
-              <w:top w:w="60" w:type="dxa"/>
-              <w:bottom w:w="60" w:type="dxa"/>
-              <w:left w:w="90" w:type="dxa"/>
-              <w:right w:w="90" w:type="dxa"/>
+              <w:top w:w="55" w:type="dxa"/>
+              <w:bottom w:w="55" w:type="dxa"/>
+              <w:left w:w="80" w:type="dxa"/>
+              <w:right w:w="80" w:type="dxa"/>
             </w:tcMar>
             <w:tcBorders>
               <w:top w:val="single" w:sz="4" w:space="0" w:color="8EA9C1"/>
@@ -1097,10 +1097,10 @@
             <w:tcW w:type="dxa" w:w="3024"/>
             <w:shd w:fill="DCE6F1"/>
             <w:tcMar>
-              <w:top w:w="60" w:type="dxa"/>
-              <w:bottom w:w="60" w:type="dxa"/>
-              <w:left w:w="90" w:type="dxa"/>
-              <w:right w:w="90" w:type="dxa"/>
+              <w:top w:w="55" w:type="dxa"/>
+              <w:bottom w:w="55" w:type="dxa"/>
+              <w:left w:w="80" w:type="dxa"/>
+              <w:right w:w="80" w:type="dxa"/>
             </w:tcMar>
             <w:tcBorders>
               <w:top w:val="single" w:sz="4" w:space="0" w:color="8EA9C1"/>
@@ -1129,10 +1129,10 @@
             <w:tcW w:type="dxa" w:w="7056"/>
             <w:shd w:fill="DCE6F1"/>
             <w:tcMar>
-              <w:top w:w="60" w:type="dxa"/>
-              <w:bottom w:w="60" w:type="dxa"/>
-              <w:left w:w="90" w:type="dxa"/>
-              <w:right w:w="90" w:type="dxa"/>
+              <w:top w:w="55" w:type="dxa"/>
+              <w:bottom w:w="55" w:type="dxa"/>
+              <w:left w:w="80" w:type="dxa"/>
+              <w:right w:w="80" w:type="dxa"/>
             </w:tcMar>
             <w:tcBorders>
               <w:top w:val="single" w:sz="4" w:space="0" w:color="8EA9C1"/>
@@ -1159,7 +1159,7 @@
     </w:tbl>
     <w:p>
       <w:pPr>
-        <w:spacing w:before="120"/>
+        <w:spacing w:before="80"/>
       </w:pPr>
       <w:r>
         <w:rPr>
@@ -1167,9 +1167,9 @@
           <w:b/>
           <w:i/>
           <w:color w:val="1F4E79"/>
-          <w:sz w:val="19"/>
+          <w:sz w:val="18"/>
         </w:rPr>
-        <w:t>Result: The forecasting engine successfully achieved high predictive accuracy (R² = 0.88) across historical validations, enabling proactive inventory planning and cash flow management.</w:t>
+        <w:t>Result: Successfully engineered the full-stack system architecture (Frontend, Backend, Database) and achieved high predictive forecasting accuracy (R² = 0.88), enabling proactive inventory and revenue planning.</w:t>
       </w:r>
     </w:p>
     <w:p>
@@ -1186,14 +1186,14 @@
           <w:rFonts w:ascii="Calibri" w:hAnsi="Calibri"/>
           <w:b/>
           <w:color w:val="1F4E79"/>
-          <w:sz w:val="25"/>
+          <w:sz w:val="24"/>
         </w:rPr>
         <w:t>Milestone 3 – Customer Churn Prediction System &amp; Automated Testing Suite</w:t>
       </w:r>
     </w:p>
     <w:p>
       <w:pPr>
-        <w:spacing w:after="120"/>
+        <w:spacing w:after="100"/>
       </w:pPr>
       <w:r>
         <w:rPr>
@@ -1212,7 +1212,7 @@
           <w:rFonts w:ascii="Calibri" w:hAnsi="Calibri"/>
           <w:b/>
           <w:color w:val="1F4E79"/>
-          <w:sz w:val="21"/>
+          <w:sz w:val="20"/>
         </w:rPr>
         <w:t>1. RFM Feature Engineering &amp; Ground-Truth Formulation</w:t>
       </w:r>
@@ -1267,14 +1267,14 @@
     </w:p>
     <w:p>
       <w:pPr>
-        <w:spacing w:before="80" w:after="40"/>
+        <w:spacing w:before="60" w:after="40"/>
       </w:pPr>
       <w:r>
         <w:rPr>
           <w:rFonts w:ascii="Calibri" w:hAnsi="Calibri"/>
           <w:b/>
           <w:color w:val="1F4E79"/>
-          <w:sz w:val="21"/>
+          <w:sz w:val="20"/>
         </w:rPr>
         <w:t>2. Supervised Classification &amp; Interactive UI</w:t>
       </w:r>
@@ -1349,10 +1349,10 @@
             <w:tcW w:type="dxa" w:w="3024"/>
             <w:shd w:fill="1F4E79"/>
             <w:tcMar>
-              <w:top w:w="80" w:type="dxa"/>
-              <w:bottom w:w="80" w:type="dxa"/>
-              <w:left w:w="100" w:type="dxa"/>
-              <w:right w:w="100" w:type="dxa"/>
+              <w:top w:w="70" w:type="dxa"/>
+              <w:bottom w:w="70" w:type="dxa"/>
+              <w:left w:w="90" w:type="dxa"/>
+              <w:right w:w="90" w:type="dxa"/>
             </w:tcMar>
             <w:tcBorders>
               <w:top w:val="single" w:sz="4" w:space="0" w:color="8EA9C1"/>
@@ -1381,10 +1381,10 @@
             <w:tcW w:type="dxa" w:w="7056"/>
             <w:shd w:fill="1F4E79"/>
             <w:tcMar>
-              <w:top w:w="80" w:type="dxa"/>
-              <w:bottom w:w="80" w:type="dxa"/>
-              <w:left w:w="100" w:type="dxa"/>
-              <w:right w:w="100" w:type="dxa"/>
+              <w:top w:w="70" w:type="dxa"/>
+              <w:bottom w:w="70" w:type="dxa"/>
+              <w:left w:w="90" w:type="dxa"/>
+              <w:right w:w="90" w:type="dxa"/>
             </w:tcMar>
             <w:tcBorders>
               <w:top w:val="single" w:sz="4" w:space="0" w:color="8EA9C1"/>
@@ -1415,10 +1415,10 @@
             <w:tcW w:type="dxa" w:w="3024"/>
             <w:shd w:fill="FFFFFF"/>
             <w:tcMar>
-              <w:top w:w="60" w:type="dxa"/>
-              <w:bottom w:w="60" w:type="dxa"/>
-              <w:left w:w="90" w:type="dxa"/>
-              <w:right w:w="90" w:type="dxa"/>
+              <w:top w:w="55" w:type="dxa"/>
+              <w:bottom w:w="55" w:type="dxa"/>
+              <w:left w:w="80" w:type="dxa"/>
+              <w:right w:w="80" w:type="dxa"/>
             </w:tcMar>
             <w:tcBorders>
               <w:top w:val="single" w:sz="4" w:space="0" w:color="8EA9C1"/>
@@ -1447,10 +1447,10 @@
             <w:tcW w:type="dxa" w:w="7056"/>
             <w:shd w:fill="FFFFFF"/>
             <w:tcMar>
-              <w:top w:w="60" w:type="dxa"/>
-              <w:bottom w:w="60" w:type="dxa"/>
-              <w:left w:w="90" w:type="dxa"/>
-              <w:right w:w="90" w:type="dxa"/>
+              <w:top w:w="55" w:type="dxa"/>
+              <w:bottom w:w="55" w:type="dxa"/>
+              <w:left w:w="80" w:type="dxa"/>
+              <w:right w:w="80" w:type="dxa"/>
             </w:tcMar>
             <w:tcBorders>
               <w:top w:val="single" w:sz="4" w:space="0" w:color="8EA9C1"/>
@@ -1480,10 +1480,10 @@
             <w:tcW w:type="dxa" w:w="3024"/>
             <w:shd w:fill="DCE6F1"/>
             <w:tcMar>
-              <w:top w:w="60" w:type="dxa"/>
-              <w:bottom w:w="60" w:type="dxa"/>
-              <w:left w:w="90" w:type="dxa"/>
-              <w:right w:w="90" w:type="dxa"/>
+              <w:top w:w="55" w:type="dxa"/>
+              <w:bottom w:w="55" w:type="dxa"/>
+              <w:left w:w="80" w:type="dxa"/>
+              <w:right w:w="80" w:type="dxa"/>
             </w:tcMar>
             <w:tcBorders>
               <w:top w:val="single" w:sz="4" w:space="0" w:color="8EA9C1"/>
@@ -1512,10 +1512,10 @@
             <w:tcW w:type="dxa" w:w="7056"/>
             <w:shd w:fill="DCE6F1"/>
             <w:tcMar>
-              <w:top w:w="60" w:type="dxa"/>
-              <w:bottom w:w="60" w:type="dxa"/>
-              <w:left w:w="90" w:type="dxa"/>
-              <w:right w:w="90" w:type="dxa"/>
+              <w:top w:w="55" w:type="dxa"/>
+              <w:bottom w:w="55" w:type="dxa"/>
+              <w:left w:w="80" w:type="dxa"/>
+              <w:right w:w="80" w:type="dxa"/>
             </w:tcMar>
             <w:tcBorders>
               <w:top w:val="single" w:sz="4" w:space="0" w:color="8EA9C1"/>
@@ -1545,10 +1545,10 @@
             <w:tcW w:type="dxa" w:w="3024"/>
             <w:shd w:fill="FFFFFF"/>
             <w:tcMar>
-              <w:top w:w="60" w:type="dxa"/>
-              <w:bottom w:w="60" w:type="dxa"/>
-              <w:left w:w="90" w:type="dxa"/>
-              <w:right w:w="90" w:type="dxa"/>
+              <w:top w:w="55" w:type="dxa"/>
+              <w:bottom w:w="55" w:type="dxa"/>
+              <w:left w:w="80" w:type="dxa"/>
+              <w:right w:w="80" w:type="dxa"/>
             </w:tcMar>
             <w:tcBorders>
               <w:top w:val="single" w:sz="4" w:space="0" w:color="8EA9C1"/>
@@ -1577,10 +1577,10 @@
             <w:tcW w:type="dxa" w:w="7056"/>
             <w:shd w:fill="FFFFFF"/>
             <w:tcMar>
-              <w:top w:w="60" w:type="dxa"/>
-              <w:bottom w:w="60" w:type="dxa"/>
-              <w:left w:w="90" w:type="dxa"/>
-              <w:right w:w="90" w:type="dxa"/>
+              <w:top w:w="55" w:type="dxa"/>
+              <w:bottom w:w="55" w:type="dxa"/>
+              <w:left w:w="80" w:type="dxa"/>
+              <w:right w:w="80" w:type="dxa"/>
             </w:tcMar>
             <w:tcBorders>
               <w:top w:val="single" w:sz="4" w:space="0" w:color="8EA9C1"/>
@@ -1610,10 +1610,10 @@
             <w:tcW w:type="dxa" w:w="3024"/>
             <w:shd w:fill="DCE6F1"/>
             <w:tcMar>
-              <w:top w:w="60" w:type="dxa"/>
-              <w:bottom w:w="60" w:type="dxa"/>
-              <w:left w:w="90" w:type="dxa"/>
-              <w:right w:w="90" w:type="dxa"/>
+              <w:top w:w="55" w:type="dxa"/>
+              <w:bottom w:w="55" w:type="dxa"/>
+              <w:left w:w="80" w:type="dxa"/>
+              <w:right w:w="80" w:type="dxa"/>
             </w:tcMar>
             <w:tcBorders>
               <w:top w:val="single" w:sz="4" w:space="0" w:color="8EA9C1"/>
@@ -1642,10 +1642,10 @@
             <w:tcW w:type="dxa" w:w="7056"/>
             <w:shd w:fill="DCE6F1"/>
             <w:tcMar>
-              <w:top w:w="60" w:type="dxa"/>
-              <w:bottom w:w="60" w:type="dxa"/>
-              <w:left w:w="90" w:type="dxa"/>
-              <w:right w:w="90" w:type="dxa"/>
+              <w:top w:w="55" w:type="dxa"/>
+              <w:bottom w:w="55" w:type="dxa"/>
+              <w:left w:w="80" w:type="dxa"/>
+              <w:right w:w="80" w:type="dxa"/>
             </w:tcMar>
             <w:tcBorders>
               <w:top w:val="single" w:sz="4" w:space="0" w:color="8EA9C1"/>
@@ -1675,10 +1675,10 @@
             <w:tcW w:type="dxa" w:w="3024"/>
             <w:shd w:fill="FFFFFF"/>
             <w:tcMar>
-              <w:top w:w="60" w:type="dxa"/>
-              <w:bottom w:w="60" w:type="dxa"/>
-              <w:left w:w="90" w:type="dxa"/>
-              <w:right w:w="90" w:type="dxa"/>
+              <w:top w:w="55" w:type="dxa"/>
+              <w:bottom w:w="55" w:type="dxa"/>
+              <w:left w:w="80" w:type="dxa"/>
+              <w:right w:w="80" w:type="dxa"/>
             </w:tcMar>
             <w:tcBorders>
               <w:top w:val="single" w:sz="4" w:space="0" w:color="8EA9C1"/>
@@ -1707,10 +1707,10 @@
             <w:tcW w:type="dxa" w:w="7056"/>
             <w:shd w:fill="FFFFFF"/>
             <w:tcMar>
-              <w:top w:w="60" w:type="dxa"/>
-              <w:bottom w:w="60" w:type="dxa"/>
-              <w:left w:w="90" w:type="dxa"/>
-              <w:right w:w="90" w:type="dxa"/>
+              <w:top w:w="55" w:type="dxa"/>
+              <w:bottom w:w="55" w:type="dxa"/>
+              <w:left w:w="80" w:type="dxa"/>
+              <w:right w:w="80" w:type="dxa"/>
             </w:tcMar>
             <w:tcBorders>
               <w:top w:val="single" w:sz="4" w:space="0" w:color="8EA9C1"/>
@@ -1740,10 +1740,10 @@
             <w:tcW w:type="dxa" w:w="3024"/>
             <w:shd w:fill="DCE6F1"/>
             <w:tcMar>
-              <w:top w:w="60" w:type="dxa"/>
-              <w:bottom w:w="60" w:type="dxa"/>
-              <w:left w:w="90" w:type="dxa"/>
-              <w:right w:w="90" w:type="dxa"/>
+              <w:top w:w="55" w:type="dxa"/>
+              <w:bottom w:w="55" w:type="dxa"/>
+              <w:left w:w="80" w:type="dxa"/>
+              <w:right w:w="80" w:type="dxa"/>
             </w:tcMar>
             <w:tcBorders>
               <w:top w:val="single" w:sz="4" w:space="0" w:color="8EA9C1"/>
@@ -1772,10 +1772,10 @@
             <w:tcW w:type="dxa" w:w="7056"/>
             <w:shd w:fill="DCE6F1"/>
             <w:tcMar>
-              <w:top w:w="60" w:type="dxa"/>
-              <w:bottom w:w="60" w:type="dxa"/>
-              <w:left w:w="90" w:type="dxa"/>
-              <w:right w:w="90" w:type="dxa"/>
+              <w:top w:w="55" w:type="dxa"/>
+              <w:bottom w:w="55" w:type="dxa"/>
+              <w:left w:w="80" w:type="dxa"/>
+              <w:right w:w="80" w:type="dxa"/>
             </w:tcMar>
             <w:tcBorders>
               <w:top w:val="single" w:sz="4" w:space="0" w:color="8EA9C1"/>
@@ -1805,10 +1805,10 @@
             <w:tcW w:type="dxa" w:w="3024"/>
             <w:shd w:fill="FFFFFF"/>
             <w:tcMar>
-              <w:top w:w="60" w:type="dxa"/>
-              <w:bottom w:w="60" w:type="dxa"/>
-              <w:left w:w="90" w:type="dxa"/>
-              <w:right w:w="90" w:type="dxa"/>
+              <w:top w:w="55" w:type="dxa"/>
+              <w:bottom w:w="55" w:type="dxa"/>
+              <w:left w:w="80" w:type="dxa"/>
+              <w:right w:w="80" w:type="dxa"/>
             </w:tcMar>
             <w:tcBorders>
               <w:top w:val="single" w:sz="4" w:space="0" w:color="8EA9C1"/>
@@ -1837,10 +1837,10 @@
             <w:tcW w:type="dxa" w:w="7056"/>
             <w:shd w:fill="FFFFFF"/>
             <w:tcMar>
-              <w:top w:w="60" w:type="dxa"/>
-              <w:bottom w:w="60" w:type="dxa"/>
-              <w:left w:w="90" w:type="dxa"/>
-              <w:right w:w="90" w:type="dxa"/>
+              <w:top w:w="55" w:type="dxa"/>
+              <w:bottom w:w="55" w:type="dxa"/>
+              <w:left w:w="80" w:type="dxa"/>
+              <w:right w:w="80" w:type="dxa"/>
             </w:tcMar>
             <w:tcBorders>
               <w:top w:val="single" w:sz="4" w:space="0" w:color="8EA9C1"/>
@@ -1867,7 +1867,7 @@
     </w:tbl>
     <w:p>
       <w:pPr>
-        <w:spacing w:before="120"/>
+        <w:spacing w:before="100"/>
       </w:pPr>
     </w:p>
     <w:tbl>
@@ -1888,10 +1888,10 @@
             <w:tcW w:type="dxa" w:w="2016"/>
             <w:shd w:fill="1F4E79"/>
             <w:tcMar>
-              <w:top w:w="80" w:type="dxa"/>
-              <w:bottom w:w="80" w:type="dxa"/>
-              <w:left w:w="100" w:type="dxa"/>
-              <w:right w:w="100" w:type="dxa"/>
+              <w:top w:w="70" w:type="dxa"/>
+              <w:bottom w:w="70" w:type="dxa"/>
+              <w:left w:w="90" w:type="dxa"/>
+              <w:right w:w="90" w:type="dxa"/>
             </w:tcMar>
             <w:tcBorders>
               <w:top w:val="single" w:sz="4" w:space="0" w:color="8EA9C1"/>
@@ -1920,10 +1920,10 @@
             <w:tcW w:type="dxa" w:w="1584"/>
             <w:shd w:fill="1F4E79"/>
             <w:tcMar>
-              <w:top w:w="80" w:type="dxa"/>
-              <w:bottom w:w="80" w:type="dxa"/>
-              <w:left w:w="100" w:type="dxa"/>
-              <w:right w:w="100" w:type="dxa"/>
+              <w:top w:w="70" w:type="dxa"/>
+              <w:bottom w:w="70" w:type="dxa"/>
+              <w:left w:w="90" w:type="dxa"/>
+              <w:right w:w="90" w:type="dxa"/>
             </w:tcMar>
             <w:tcBorders>
               <w:top w:val="single" w:sz="4" w:space="0" w:color="8EA9C1"/>
@@ -1952,10 +1952,10 @@
             <w:tcW w:type="dxa" w:w="6480"/>
             <w:shd w:fill="1F4E79"/>
             <w:tcMar>
-              <w:top w:w="80" w:type="dxa"/>
-              <w:bottom w:w="80" w:type="dxa"/>
-              <w:left w:w="100" w:type="dxa"/>
-              <w:right w:w="100" w:type="dxa"/>
+              <w:top w:w="70" w:type="dxa"/>
+              <w:bottom w:w="70" w:type="dxa"/>
+              <w:left w:w="90" w:type="dxa"/>
+              <w:right w:w="90" w:type="dxa"/>
             </w:tcMar>
             <w:tcBorders>
               <w:top w:val="single" w:sz="4" w:space="0" w:color="8EA9C1"/>
@@ -1986,10 +1986,10 @@
             <w:tcW w:type="dxa" w:w="2016"/>
             <w:shd w:fill="FFFFFF"/>
             <w:tcMar>
-              <w:top w:w="60" w:type="dxa"/>
-              <w:bottom w:w="60" w:type="dxa"/>
-              <w:left w:w="90" w:type="dxa"/>
-              <w:right w:w="90" w:type="dxa"/>
+              <w:top w:w="55" w:type="dxa"/>
+              <w:bottom w:w="55" w:type="dxa"/>
+              <w:left w:w="80" w:type="dxa"/>
+              <w:right w:w="80" w:type="dxa"/>
             </w:tcMar>
             <w:tcBorders>
               <w:top w:val="single" w:sz="4" w:space="0" w:color="8EA9C1"/>
@@ -2018,10 +2018,10 @@
             <w:tcW w:type="dxa" w:w="1584"/>
             <w:shd w:fill="FFFFFF"/>
             <w:tcMar>
-              <w:top w:w="60" w:type="dxa"/>
-              <w:bottom w:w="60" w:type="dxa"/>
-              <w:left w:w="90" w:type="dxa"/>
-              <w:right w:w="90" w:type="dxa"/>
+              <w:top w:w="55" w:type="dxa"/>
+              <w:bottom w:w="55" w:type="dxa"/>
+              <w:left w:w="80" w:type="dxa"/>
+              <w:right w:w="80" w:type="dxa"/>
             </w:tcMar>
             <w:tcBorders>
               <w:top w:val="single" w:sz="4" w:space="0" w:color="8EA9C1"/>
@@ -2049,10 +2049,10 @@
             <w:tcW w:type="dxa" w:w="6480"/>
             <w:shd w:fill="FFFFFF"/>
             <w:tcMar>
-              <w:top w:w="60" w:type="dxa"/>
-              <w:bottom w:w="60" w:type="dxa"/>
-              <w:left w:w="90" w:type="dxa"/>
-              <w:right w:w="90" w:type="dxa"/>
+              <w:top w:w="55" w:type="dxa"/>
+              <w:bottom w:w="55" w:type="dxa"/>
+              <w:left w:w="80" w:type="dxa"/>
+              <w:right w:w="80" w:type="dxa"/>
             </w:tcMar>
             <w:tcBorders>
               <w:top w:val="single" w:sz="4" w:space="0" w:color="8EA9C1"/>
@@ -2082,10 +2082,10 @@
             <w:tcW w:type="dxa" w:w="2016"/>
             <w:shd w:fill="DCE6F1"/>
             <w:tcMar>
-              <w:top w:w="60" w:type="dxa"/>
-              <w:bottom w:w="60" w:type="dxa"/>
-              <w:left w:w="90" w:type="dxa"/>
-              <w:right w:w="90" w:type="dxa"/>
+              <w:top w:w="55" w:type="dxa"/>
+              <w:bottom w:w="55" w:type="dxa"/>
+              <w:left w:w="80" w:type="dxa"/>
+              <w:right w:w="80" w:type="dxa"/>
             </w:tcMar>
             <w:tcBorders>
               <w:top w:val="single" w:sz="4" w:space="0" w:color="8EA9C1"/>
@@ -2114,10 +2114,10 @@
             <w:tcW w:type="dxa" w:w="1584"/>
             <w:shd w:fill="DCE6F1"/>
             <w:tcMar>
-              <w:top w:w="60" w:type="dxa"/>
-              <w:bottom w:w="60" w:type="dxa"/>
-              <w:left w:w="90" w:type="dxa"/>
-              <w:right w:w="90" w:type="dxa"/>
+              <w:top w:w="55" w:type="dxa"/>
+              <w:bottom w:w="55" w:type="dxa"/>
+              <w:left w:w="80" w:type="dxa"/>
+              <w:right w:w="80" w:type="dxa"/>
             </w:tcMar>
             <w:tcBorders>
               <w:top w:val="single" w:sz="4" w:space="0" w:color="8EA9C1"/>
@@ -2145,10 +2145,10 @@
             <w:tcW w:type="dxa" w:w="6480"/>
             <w:shd w:fill="DCE6F1"/>
             <w:tcMar>
-              <w:top w:w="60" w:type="dxa"/>
-              <w:bottom w:w="60" w:type="dxa"/>
-              <w:left w:w="90" w:type="dxa"/>
-              <w:right w:w="90" w:type="dxa"/>
+              <w:top w:w="55" w:type="dxa"/>
+              <w:bottom w:w="55" w:type="dxa"/>
+              <w:left w:w="80" w:type="dxa"/>
+              <w:right w:w="80" w:type="dxa"/>
             </w:tcMar>
             <w:tcBorders>
               <w:top w:val="single" w:sz="4" w:space="0" w:color="8EA9C1"/>
@@ -2178,10 +2178,10 @@
             <w:tcW w:type="dxa" w:w="2016"/>
             <w:shd w:fill="FFFFFF"/>
             <w:tcMar>
-              <w:top w:w="60" w:type="dxa"/>
-              <w:bottom w:w="60" w:type="dxa"/>
-              <w:left w:w="90" w:type="dxa"/>
-              <w:right w:w="90" w:type="dxa"/>
+              <w:top w:w="55" w:type="dxa"/>
+              <w:bottom w:w="55" w:type="dxa"/>
+              <w:left w:w="80" w:type="dxa"/>
+              <w:right w:w="80" w:type="dxa"/>
             </w:tcMar>
             <w:tcBorders>
               <w:top w:val="single" w:sz="4" w:space="0" w:color="8EA9C1"/>
@@ -2210,10 +2210,10 @@
             <w:tcW w:type="dxa" w:w="1584"/>
             <w:shd w:fill="FFFFFF"/>
             <w:tcMar>
-              <w:top w:w="60" w:type="dxa"/>
-              <w:bottom w:w="60" w:type="dxa"/>
-              <w:left w:w="90" w:type="dxa"/>
-              <w:right w:w="90" w:type="dxa"/>
+              <w:top w:w="55" w:type="dxa"/>
+              <w:bottom w:w="55" w:type="dxa"/>
+              <w:left w:w="80" w:type="dxa"/>
+              <w:right w:w="80" w:type="dxa"/>
             </w:tcMar>
             <w:tcBorders>
               <w:top w:val="single" w:sz="4" w:space="0" w:color="8EA9C1"/>
@@ -2241,10 +2241,10 @@
             <w:tcW w:type="dxa" w:w="6480"/>
             <w:shd w:fill="FFFFFF"/>
             <w:tcMar>
-              <w:top w:w="60" w:type="dxa"/>
-              <w:bottom w:w="60" w:type="dxa"/>
-              <w:left w:w="90" w:type="dxa"/>
-              <w:right w:w="90" w:type="dxa"/>
+              <w:top w:w="55" w:type="dxa"/>
+              <w:bottom w:w="55" w:type="dxa"/>
+              <w:left w:w="80" w:type="dxa"/>
+              <w:right w:w="80" w:type="dxa"/>
             </w:tcMar>
             <w:tcBorders>
               <w:top w:val="single" w:sz="4" w:space="0" w:color="8EA9C1"/>
@@ -2271,12 +2271,12 @@
     </w:tbl>
     <w:p>
       <w:pPr>
-        <w:spacing w:before="80" w:after="60"/>
+        <w:spacing w:before="60" w:after="40"/>
       </w:pPr>
       <w:r>
         <w:rPr>
           <w:rFonts w:ascii="Calibri" w:hAnsi="Calibri"/>
-          <w:sz w:val="19"/>
+          <w:sz w:val="18"/>
         </w:rPr>
         <w:t>The churn prediction work was directly connected with the transaction preprocessing and RFM analytics performed in earlier milestones, translating raw purchase cadence into automated early-warning retention triggers.</w:t>
       </w:r>
@@ -2288,7 +2288,7 @@
           <w:b/>
           <w:i/>
           <w:color w:val="1F4E79"/>
-          <w:sz w:val="19"/>
+          <w:sz w:val="18"/>
         </w:rPr>
         <w:t>Result: The churn prediction system identified 270 high-risk accounts (34.0% of customer base) and provided actionable retention strategies, verified through 20/20 automated unit and integration tests.</w:t>
       </w:r>
@@ -2382,10 +2382,10 @@
             <w:tcW w:type="dxa" w:w="2592"/>
             <w:shd w:fill="1F4E79"/>
             <w:tcMar>
-              <w:top w:w="80" w:type="dxa"/>
-              <w:bottom w:w="80" w:type="dxa"/>
-              <w:left w:w="100" w:type="dxa"/>
-              <w:right w:w="100" w:type="dxa"/>
+              <w:top w:w="70" w:type="dxa"/>
+              <w:bottom w:w="70" w:type="dxa"/>
+              <w:left w:w="90" w:type="dxa"/>
+              <w:right w:w="90" w:type="dxa"/>
             </w:tcMar>
             <w:tcBorders>
               <w:top w:val="single" w:sz="4" w:space="0" w:color="8EA9C1"/>
@@ -2414,10 +2414,10 @@
             <w:tcW w:type="dxa" w:w="7488"/>
             <w:shd w:fill="1F4E79"/>
             <w:tcMar>
-              <w:top w:w="80" w:type="dxa"/>
-              <w:bottom w:w="80" w:type="dxa"/>
-              <w:left w:w="100" w:type="dxa"/>
-              <w:right w:w="100" w:type="dxa"/>
+              <w:top w:w="70" w:type="dxa"/>
+              <w:bottom w:w="70" w:type="dxa"/>
+              <w:left w:w="90" w:type="dxa"/>
+              <w:right w:w="90" w:type="dxa"/>
             </w:tcMar>
             <w:tcBorders>
               <w:top w:val="single" w:sz="4" w:space="0" w:color="8EA9C1"/>
@@ -2448,10 +2448,10 @@
             <w:tcW w:type="dxa" w:w="2592"/>
             <w:shd w:fill="FFFFFF"/>
             <w:tcMar>
-              <w:top w:w="60" w:type="dxa"/>
-              <w:bottom w:w="60" w:type="dxa"/>
-              <w:left w:w="90" w:type="dxa"/>
-              <w:right w:w="90" w:type="dxa"/>
+              <w:top w:w="55" w:type="dxa"/>
+              <w:bottom w:w="55" w:type="dxa"/>
+              <w:left w:w="80" w:type="dxa"/>
+              <w:right w:w="80" w:type="dxa"/>
             </w:tcMar>
             <w:tcBorders>
               <w:top w:val="single" w:sz="4" w:space="0" w:color="8EA9C1"/>
@@ -2480,10 +2480,10 @@
             <w:tcW w:type="dxa" w:w="7488"/>
             <w:shd w:fill="FFFFFF"/>
             <w:tcMar>
-              <w:top w:w="60" w:type="dxa"/>
-              <w:bottom w:w="60" w:type="dxa"/>
-              <w:left w:w="90" w:type="dxa"/>
-              <w:right w:w="90" w:type="dxa"/>
+              <w:top w:w="55" w:type="dxa"/>
+              <w:bottom w:w="55" w:type="dxa"/>
+              <w:left w:w="80" w:type="dxa"/>
+              <w:right w:w="80" w:type="dxa"/>
             </w:tcMar>
             <w:tcBorders>
               <w:top w:val="single" w:sz="4" w:space="0" w:color="8EA9C1"/>
@@ -2513,10 +2513,10 @@
             <w:tcW w:type="dxa" w:w="2592"/>
             <w:shd w:fill="DCE6F1"/>
             <w:tcMar>
-              <w:top w:w="60" w:type="dxa"/>
-              <w:bottom w:w="60" w:type="dxa"/>
-              <w:left w:w="90" w:type="dxa"/>
-              <w:right w:w="90" w:type="dxa"/>
+              <w:top w:w="55" w:type="dxa"/>
+              <w:bottom w:w="55" w:type="dxa"/>
+              <w:left w:w="80" w:type="dxa"/>
+              <w:right w:w="80" w:type="dxa"/>
             </w:tcMar>
             <w:tcBorders>
               <w:top w:val="single" w:sz="4" w:space="0" w:color="8EA9C1"/>
@@ -2545,10 +2545,10 @@
             <w:tcW w:type="dxa" w:w="7488"/>
             <w:shd w:fill="DCE6F1"/>
             <w:tcMar>
-              <w:top w:w="60" w:type="dxa"/>
-              <w:bottom w:w="60" w:type="dxa"/>
-              <w:left w:w="90" w:type="dxa"/>
-              <w:right w:w="90" w:type="dxa"/>
+              <w:top w:w="55" w:type="dxa"/>
+              <w:bottom w:w="55" w:type="dxa"/>
+              <w:left w:w="80" w:type="dxa"/>
+              <w:right w:w="80" w:type="dxa"/>
             </w:tcMar>
             <w:tcBorders>
               <w:top w:val="single" w:sz="4" w:space="0" w:color="8EA9C1"/>
@@ -2578,10 +2578,10 @@
             <w:tcW w:type="dxa" w:w="2592"/>
             <w:shd w:fill="FFFFFF"/>
             <w:tcMar>
-              <w:top w:w="60" w:type="dxa"/>
-              <w:bottom w:w="60" w:type="dxa"/>
-              <w:left w:w="90" w:type="dxa"/>
-              <w:right w:w="90" w:type="dxa"/>
+              <w:top w:w="55" w:type="dxa"/>
+              <w:bottom w:w="55" w:type="dxa"/>
+              <w:left w:w="80" w:type="dxa"/>
+              <w:right w:w="80" w:type="dxa"/>
             </w:tcMar>
             <w:tcBorders>
               <w:top w:val="single" w:sz="4" w:space="0" w:color="8EA9C1"/>
@@ -2610,10 +2610,10 @@
             <w:tcW w:type="dxa" w:w="7488"/>
             <w:shd w:fill="FFFFFF"/>
             <w:tcMar>
-              <w:top w:w="60" w:type="dxa"/>
-              <w:bottom w:w="60" w:type="dxa"/>
-              <w:left w:w="90" w:type="dxa"/>
-              <w:right w:w="90" w:type="dxa"/>
+              <w:top w:w="55" w:type="dxa"/>
+              <w:bottom w:w="55" w:type="dxa"/>
+              <w:left w:w="80" w:type="dxa"/>
+              <w:right w:w="80" w:type="dxa"/>
             </w:tcMar>
             <w:tcBorders>
               <w:top w:val="single" w:sz="4" w:space="0" w:color="8EA9C1"/>

</xml_diff>